<commit_message>
feat: refactor code structure and add Vite configuration
- Refactored the calculateYOE function in exp.js for better readability.
- Updated index.css with consistent formatting.
- Created a new index.jsx file to serve as the entry point for the React application.
- Refactored theme definitions in Themes.js for clarity.
- Improved analytics tracking functions in analytics.js.
- Enhanced motion animations in motion.js for smoother transitions.
- Added Vite configuration file for project setup and build process.
</commit_message>
<xml_diff>
--- a/public/K-Karthikeyan.docx
+++ b/public/K-Karthikeyan.docx
@@ -8,43 +8,33 @@
         <w:ind w:left="0" w:firstLine="0"/>
         <w:jc w:val="both"/>
       </w:pPr>
-      <w:r>
-        <w:fldChar w:fldCharType="begin"/>
-      </w:r>
-      <w:r>
-        <w:instrText>HYPERLINK "https://kkarthik3.github.io/"</w:instrText>
-      </w:r>
-      <w:r>
-        <w:fldChar w:fldCharType="separate"/>
-      </w:r>
-      <w:r>
-        <w:rPr>
-          <w:rStyle w:val="Hyperlink"/>
+      <w:hyperlink r:id="rId6" w:history="1">
+        <w:r>
+          <w:rPr>
+            <w:rStyle w:val="Hyperlink"/>
+            <w:b/>
+            <w:sz w:val="40"/>
+            <w:szCs w:val="28"/>
+            <w:u w:val="none"/>
+          </w:rPr>
+          <w:t>KARTHIKEYAN K</w:t>
+        </w:r>
+        <w:r>
+          <w:rPr>
+            <w:rStyle w:val="Hyperlink"/>
+            <w:b/>
+            <w:sz w:val="40"/>
+            <w:szCs w:val="28"/>
+            <w:u w:val="none"/>
+          </w:rPr>
+          <w:t xml:space="preserve">             </w:t>
+        </w:r>
+      </w:hyperlink>
+      <w:r>
+        <w:rPr>
           <w:b/>
           <w:sz w:val="40"/>
           <w:szCs w:val="28"/>
-          <w:u w:val="none"/>
-        </w:rPr>
-        <w:t>KARTHIKEYAN K</w:t>
-      </w:r>
-      <w:r>
-        <w:rPr>
-          <w:rStyle w:val="Hyperlink"/>
-          <w:b/>
-          <w:sz w:val="40"/>
-          <w:szCs w:val="28"/>
-          <w:u w:val="none"/>
-        </w:rPr>
-        <w:t xml:space="preserve">             </w:t>
-      </w:r>
-      <w:r>
-        <w:fldChar w:fldCharType="end"/>
-      </w:r>
-      <w:r>
-        <w:rPr>
-          <w:b/>
-          <w:sz w:val="40"/>
-          <w:szCs w:val="28"/>
         </w:rPr>
         <w:t xml:space="preserve"> </w:t>
       </w:r>
@@ -64,7 +54,6 @@
         </w:rPr>
         <w:tab/>
       </w:r>
-      <w:proofErr w:type="gramStart"/>
       <w:r>
         <w:rPr>
           <w:b/>
@@ -81,7 +70,6 @@
         </w:rPr>
         <w:t>|</w:t>
       </w:r>
-      <w:proofErr w:type="gramEnd"/>
       <w:r>
         <w:rPr>
           <w:b/>
@@ -114,7 +102,7 @@
         </w:rPr>
         <w:t>|</w:t>
       </w:r>
-      <w:hyperlink r:id="rId6" w:history="1">
+      <w:hyperlink r:id="rId7" w:history="1">
         <w:r>
           <w:rPr>
             <w:rStyle w:val="Hyperlink"/>
@@ -158,7 +146,23 @@
           <w:sz w:val="24"/>
           <w:szCs w:val="28"/>
         </w:rPr>
-        <w:t xml:space="preserve"> / ML Engineer</w:t>
+        <w:t xml:space="preserve"> / </w:t>
+      </w:r>
+      <w:r>
+        <w:rPr>
+          <w:b/>
+          <w:sz w:val="24"/>
+          <w:szCs w:val="28"/>
+        </w:rPr>
+        <w:t xml:space="preserve">AI </w:t>
+      </w:r>
+      <w:r>
+        <w:rPr>
+          <w:b/>
+          <w:sz w:val="24"/>
+          <w:szCs w:val="28"/>
+        </w:rPr>
+        <w:t>ML Engineer</w:t>
       </w:r>
       <w:r>
         <w:rPr>
@@ -186,42 +190,7 @@
           <w:b/>
           <w:szCs w:val="24"/>
         </w:rPr>
-        <w:t>|</w:t>
-      </w:r>
-      <w:r>
-        <w:rPr>
-          <w:b/>
-          <w:szCs w:val="24"/>
-        </w:rPr>
-        <w:t xml:space="preserve"> </w:t>
-      </w:r>
-      <w:hyperlink r:id="rId7" w:history="1">
-        <w:proofErr w:type="spellStart"/>
-        <w:r>
-          <w:rPr>
-            <w:rStyle w:val="Hyperlink"/>
-            <w:b/>
-            <w:szCs w:val="24"/>
-          </w:rPr>
-          <w:t>Github</w:t>
-        </w:r>
-        <w:proofErr w:type="spellEnd"/>
-        <w:r>
-          <w:rPr>
-            <w:rStyle w:val="Hyperlink"/>
-            <w:b/>
-            <w:szCs w:val="24"/>
-          </w:rPr>
-          <w:t>/kkarthik3</w:t>
-        </w:r>
-      </w:hyperlink>
-      <w:r>
-        <w:rPr>
-          <w:rStyle w:val="Hyperlink"/>
-          <w:b/>
-          <w:szCs w:val="24"/>
-        </w:rPr>
-        <w:t xml:space="preserve"> </w:t>
+        <w:t xml:space="preserve">                </w:t>
       </w:r>
       <w:r>
         <w:rPr>
@@ -244,25 +213,39 @@
             <w:b/>
             <w:szCs w:val="24"/>
           </w:rPr>
-          <w:t>LinkedIn/</w:t>
+          <w:t>Github/kkarthik3</w:t>
         </w:r>
-        <w:proofErr w:type="spellStart"/>
+      </w:hyperlink>
+      <w:r>
+        <w:rPr>
+          <w:rStyle w:val="Hyperlink"/>
+          <w:b/>
+          <w:szCs w:val="24"/>
+        </w:rPr>
+        <w:t xml:space="preserve"> </w:t>
+      </w:r>
+      <w:r>
+        <w:rPr>
+          <w:b/>
+          <w:szCs w:val="24"/>
+        </w:rPr>
+        <w:t>|</w:t>
+      </w:r>
+      <w:r>
+        <w:rPr>
+          <w:b/>
+          <w:szCs w:val="24"/>
+        </w:rPr>
+        <w:t xml:space="preserve"> </w:t>
+      </w:r>
+      <w:hyperlink r:id="rId9" w:history="1">
         <w:r>
           <w:rPr>
             <w:rStyle w:val="Hyperlink"/>
             <w:b/>
             <w:szCs w:val="24"/>
           </w:rPr>
-          <w:t>kkarthick</w:t>
-        </w:r>
-        <w:proofErr w:type="spellEnd"/>
-        <w:r>
-          <w:rPr>
-            <w:rStyle w:val="Hyperlink"/>
-            <w:b/>
-            <w:szCs w:val="24"/>
-          </w:rPr>
-          <w:t>-k</w:t>
+          <w:t>LinkedIn/kkarthick-k</w:t>
         </w:r>
       </w:hyperlink>
       <w:r>
@@ -280,7 +263,7 @@
         </w:rPr>
         <w:t>|</w:t>
       </w:r>
-      <w:hyperlink r:id="rId9" w:history="1">
+      <w:hyperlink r:id="rId10" w:history="1">
         <w:r>
           <w:rPr>
             <w:rStyle w:val="Hyperlink"/>
@@ -295,34 +278,7 @@
           <w:b/>
           <w:szCs w:val="24"/>
         </w:rPr>
-        <w:t xml:space="preserve">| </w:t>
-      </w:r>
-      <w:hyperlink r:id="rId10" w:history="1">
-        <w:proofErr w:type="spellStart"/>
-        <w:r>
-          <w:rPr>
-            <w:rStyle w:val="Hyperlink"/>
-            <w:b/>
-            <w:szCs w:val="24"/>
-          </w:rPr>
-          <w:t>kaggle</w:t>
-        </w:r>
-        <w:proofErr w:type="spellEnd"/>
-        <w:r>
-          <w:rPr>
-            <w:rStyle w:val="Hyperlink"/>
-            <w:b/>
-            <w:szCs w:val="24"/>
-          </w:rPr>
-          <w:t>/kk3103</w:t>
-        </w:r>
-      </w:hyperlink>
-      <w:r>
-        <w:rPr>
-          <w:b/>
-          <w:szCs w:val="24"/>
-        </w:rPr>
-        <w:t xml:space="preserve"> |</w:t>
+        <w:t>|</w:t>
       </w:r>
     </w:p>
     <w:p>
@@ -427,55 +383,77 @@
           <w:bCs/>
           <w:szCs w:val="24"/>
         </w:rPr>
-        <w:t xml:space="preserve">Machine Learning Engineer with 2.5 years of professional experience, including 1.5 years in AI/ML and 1 year in data operations. Experienced in designing and deploying RAG-based chatbots, vector search engines, and real-time computer vision systems using </w:t>
-      </w:r>
-      <w:proofErr w:type="spellStart"/>
+        <w:t xml:space="preserve">Machine Learning Engineer with </w:t>
+      </w:r>
       <w:r>
         <w:rPr>
           <w:bCs/>
           <w:szCs w:val="24"/>
         </w:rPr>
-        <w:t>LangChain</w:t>
-      </w:r>
-      <w:proofErr w:type="spellEnd"/>
+        <w:t>3.5+</w:t>
+      </w:r>
       <w:r>
         <w:rPr>
           <w:bCs/>
           <w:szCs w:val="24"/>
         </w:rPr>
-        <w:t xml:space="preserve">, </w:t>
-      </w:r>
-      <w:proofErr w:type="spellStart"/>
+        <w:t xml:space="preserve"> years of professional experience, including </w:t>
+      </w:r>
       <w:r>
         <w:rPr>
           <w:bCs/>
           <w:szCs w:val="24"/>
         </w:rPr>
-        <w:t>LangGraph</w:t>
-      </w:r>
-      <w:proofErr w:type="spellEnd"/>
+        <w:t>2.5</w:t>
+      </w:r>
       <w:r>
         <w:rPr>
           <w:bCs/>
           <w:szCs w:val="24"/>
         </w:rPr>
-        <w:t xml:space="preserve">, Neo4j, </w:t>
-      </w:r>
-      <w:proofErr w:type="spellStart"/>
+        <w:t xml:space="preserve"> years in AI/ML and 1 year in</w:t>
+      </w:r>
       <w:r>
         <w:rPr>
           <w:bCs/>
           <w:szCs w:val="24"/>
         </w:rPr>
-        <w:t>FastAPI</w:t>
-      </w:r>
-      <w:proofErr w:type="spellEnd"/>
+        <w:t xml:space="preserve"> Python</w:t>
+      </w:r>
       <w:r>
         <w:rPr>
           <w:bCs/>
           <w:szCs w:val="24"/>
         </w:rPr>
-        <w:t xml:space="preserve">, and cloud platforms such as AWS and Kubernetes. Skilled in data preprocessing, model development, and scalable deployment, delivering production-ready AI solutions that drive efficiency and improve user experiences across bioinformatics, e-commerce, and </w:t>
+        <w:t xml:space="preserve"> data operations. Experienced in designing and deploying RAG-based chatbots, vector search engines, </w:t>
+      </w:r>
+      <w:r>
+        <w:rPr>
+          <w:bCs/>
+          <w:szCs w:val="24"/>
+        </w:rPr>
+        <w:t xml:space="preserve">Multi Agent Orchestration </w:t>
+      </w:r>
+      <w:r>
+        <w:rPr>
+          <w:bCs/>
+          <w:szCs w:val="24"/>
+        </w:rPr>
+        <w:t xml:space="preserve">and real-time computer vision systems using LangChain, LangGraph, Neo4j, FastAPI, and cloud platforms such as AWS and Kubernetes. Skilled in data preprocessing, model development, and scalable deployment, delivering production-ready AI solutions that drive efficiency and improve user experiences across </w:t>
+      </w:r>
+      <w:r>
+        <w:rPr>
+          <w:bCs/>
+          <w:szCs w:val="24"/>
+        </w:rPr>
+        <w:t>US Healthcare</w:t>
+      </w:r>
+      <w:r>
+        <w:rPr>
+          <w:bCs/>
+          <w:szCs w:val="24"/>
+        </w:rPr>
+        <w:t xml:space="preserve">, e-commerce, and </w:t>
       </w:r>
       <w:r>
         <w:rPr>
@@ -590,14 +568,225 @@
         <w:rPr>
           <w:b/>
         </w:rPr>
-        <w:t xml:space="preserve">Machine Learning </w:t>
-      </w:r>
-      <w:proofErr w:type="gramStart"/>
-      <w:r>
-        <w:rPr>
-          <w:b/>
-        </w:rPr>
-        <w:t>Engineer</w:t>
+        <w:t>AI/ML Engineer</w:t>
+      </w:r>
+      <w:r>
+        <w:rPr>
+          <w:b/>
+          <w:bCs/>
+        </w:rPr>
+        <w:t xml:space="preserve"> [</w:t>
+      </w:r>
+      <w:hyperlink r:id="rId16" w:history="1">
+        <w:r>
+          <w:rPr>
+            <w:rStyle w:val="Hyperlink"/>
+          </w:rPr>
+          <w:t>Value Health Solutions, Coimbatore</w:t>
+        </w:r>
+      </w:hyperlink>
+      <w:r>
+        <w:rPr>
+          <w:b/>
+          <w:bCs/>
+        </w:rPr>
+        <w:t xml:space="preserve">] </w:t>
+      </w:r>
+      <w:r>
+        <w:rPr>
+          <w:b/>
+          <w:bCs/>
+        </w:rPr>
+        <w:t xml:space="preserve">                                                                              </w:t>
+      </w:r>
+      <w:r>
+        <w:rPr>
+          <w:b/>
+        </w:rPr>
+        <w:t>Dec</w:t>
+      </w:r>
+      <w:r>
+        <w:rPr>
+          <w:b/>
+        </w:rPr>
+        <w:t xml:space="preserve"> 2025 – </w:t>
+      </w:r>
+      <w:r>
+        <w:rPr>
+          <w:b/>
+        </w:rPr>
+        <w:t>Present</w:t>
+      </w:r>
+    </w:p>
+    <w:p>
+      <w:pPr>
+        <w:numPr>
+          <w:ilvl w:val="0"/>
+          <w:numId w:val="5"/>
+        </w:numPr>
+        <w:spacing w:after="0"/>
+        <w:ind w:left="631" w:hanging="347"/>
+        <w:jc w:val="both"/>
+        <w:rPr>
+          <w:lang w:val="en-IN"/>
+        </w:rPr>
+      </w:pPr>
+      <w:r>
+        <w:rPr>
+          <w:b/>
+          <w:bCs/>
+        </w:rPr>
+        <w:t>AI-Driven SDLC &amp; Intelligent Project Management</w:t>
+      </w:r>
+      <w:r>
+        <w:rPr>
+          <w:b/>
+          <w:bCs/>
+        </w:rPr>
+        <w:t xml:space="preserve">: </w:t>
+      </w:r>
+      <w:r>
+        <w:rPr>
+          <w:lang w:val="en-IN"/>
+        </w:rPr>
+        <w:t>Developed an AI-powered SDLC tracking and project management solution integrating Jira and Microsoft ecosystem services through enterprise connectors and Model Context Protocol (MCP)-based tool integrations. Enabled AI agents to interact with project management tools, retrieve contextual information, automate task-related workflows, and consolidate project status, dependencies, and delivery progress across enterprise systems. Designed tool-calling workflows to support AI-assisted project monitoring and development lifecycle management.</w:t>
+      </w:r>
+    </w:p>
+    <w:p>
+      <w:pPr>
+        <w:numPr>
+          <w:ilvl w:val="0"/>
+          <w:numId w:val="5"/>
+        </w:numPr>
+        <w:spacing w:after="0"/>
+        <w:ind w:left="631" w:hanging="347"/>
+        <w:jc w:val="both"/>
+        <w:rPr>
+          <w:lang w:val="en-IN"/>
+        </w:rPr>
+      </w:pPr>
+      <w:r>
+        <w:rPr>
+          <w:b/>
+          <w:bCs/>
+        </w:rPr>
+        <w:t xml:space="preserve">Multi-EHR </w:t>
+      </w:r>
+      <w:r>
+        <w:rPr>
+          <w:b/>
+          <w:bCs/>
+        </w:rPr>
+        <w:t xml:space="preserve">AI </w:t>
+      </w:r>
+      <w:r>
+        <w:rPr>
+          <w:b/>
+          <w:bCs/>
+        </w:rPr>
+        <w:t>Interoperability Platform</w:t>
+      </w:r>
+      <w:r>
+        <w:rPr>
+          <w:b/>
+          <w:bCs/>
+        </w:rPr>
+        <w:t xml:space="preserve"> - Medivo</w:t>
+      </w:r>
+      <w:r>
+        <w:rPr>
+          <w:b/>
+          <w:bCs/>
+        </w:rPr>
+        <w:t xml:space="preserve">: </w:t>
+      </w:r>
+      <w:r>
+        <w:rPr>
+          <w:lang w:val="en-IN"/>
+        </w:rPr>
+        <w:t xml:space="preserve">Contributed to the development </w:t>
+      </w:r>
+      <w:r>
+        <w:rPr>
+          <w:lang w:val="en-IN"/>
+        </w:rPr>
+        <w:t>in</w:t>
+      </w:r>
+      <w:r>
+        <w:rPr>
+          <w:lang w:val="en-IN"/>
+        </w:rPr>
+        <w:t xml:space="preserve"> Medivo, a healthcare interoperability platform that integrates with multiple Electronic Health Record (EHR) systems using SMART on FHIR and HL7 FHIR standards. Enabled secure connectivity with healthcare systems to retrieve and consume</w:t>
+      </w:r>
+      <w:r>
+        <w:rPr>
+          <w:lang w:val="en-IN"/>
+        </w:rPr>
+        <w:t xml:space="preserve"> over 200+</w:t>
+      </w:r>
+      <w:r>
+        <w:rPr>
+          <w:lang w:val="en-IN"/>
+        </w:rPr>
+        <w:t xml:space="preserve"> real-time clinical data through FHIR APIs, supporting interoperability across disparate EHR platforms and facilitating access to patient information for downstream healthcare workflows.</w:t>
+      </w:r>
+    </w:p>
+    <w:p>
+      <w:pPr>
+        <w:numPr>
+          <w:ilvl w:val="0"/>
+          <w:numId w:val="5"/>
+        </w:numPr>
+        <w:spacing w:after="0"/>
+        <w:ind w:left="631" w:hanging="347"/>
+        <w:jc w:val="both"/>
+      </w:pPr>
+      <w:r>
+        <w:rPr>
+          <w:b/>
+          <w:bCs/>
+        </w:rPr>
+        <w:t xml:space="preserve"> Graph RAG Pipeline Development: </w:t>
+      </w:r>
+      <w:r>
+        <w:t xml:space="preserve">Introduced and led adoption of Graph Retrieval-Augmented Generation (Graph RAG) for enterprise RAG applications, designing a scalable knowledge graph–based retrieval pipeline with custom components for AWS Bedrock, Textract, and domain-specific data loaders to enable context-aware, multi-hop reasoning. </w:t>
+      </w:r>
+    </w:p>
+    <w:p>
+      <w:pPr>
+        <w:numPr>
+          <w:ilvl w:val="0"/>
+          <w:numId w:val="5"/>
+        </w:numPr>
+        <w:spacing w:after="0"/>
+        <w:ind w:left="631" w:hanging="347"/>
+        <w:jc w:val="both"/>
+      </w:pPr>
+      <w:r>
+        <w:rPr>
+          <w:b/>
+          <w:bCs/>
+        </w:rPr>
+        <w:t>AI-Powered Revenue Cycle Management (RCM) Application:</w:t>
+      </w:r>
+      <w:r>
+        <w:t xml:space="preserve"> Developed an AI-powered Revenue Cycle Management (RCM) dashboard that automates patient intake processing using OCR and AI agents, extracting and validating clinical and billing information from patient intake forms. Built intelligent workflows to calculate medical billing and cost estimation using CPT, ICD, and diagnosis codes, improving billing accuracy and operational efficiency. Designed AI agents to identify and map doctor information directly from patient intake forms and clinical records. Integrated and collaborated with 10+ US healthcare payers to streamline claims processing, eligibility verification, and billing workflows across healthcare operations.</w:t>
+      </w:r>
+    </w:p>
+    <w:p>
+      <w:pPr>
+        <w:spacing w:after="0" w:line="259" w:lineRule="auto"/>
+        <w:ind w:left="2127" w:hanging="2127"/>
+        <w:jc w:val="both"/>
+        <w:rPr>
+          <w:b/>
+        </w:rPr>
+      </w:pPr>
+      <w:r>
+        <w:rPr>
+          <w:b/>
+        </w:rPr>
+        <w:t>Machine Learning Engineer</w:t>
       </w:r>
       <w:r>
         <w:rPr>
@@ -605,51 +794,26 @@
         </w:rPr>
         <w:t>[</w:t>
       </w:r>
-      <w:proofErr w:type="gramEnd"/>
-      <w:r>
-        <w:fldChar w:fldCharType="begin"/>
-      </w:r>
-      <w:r>
-        <w:instrText>HYPERLINK "https://kaditinnovations.com/"</w:instrText>
-      </w:r>
-      <w:r>
-        <w:fldChar w:fldCharType="separate"/>
-      </w:r>
-      <w:r>
-        <w:rPr>
-          <w:rStyle w:val="Hyperlink"/>
-        </w:rPr>
-        <w:t>Ka</w:t>
-      </w:r>
-      <w:r>
-        <w:rPr>
-          <w:rStyle w:val="Hyperlink"/>
-        </w:rPr>
-        <w:t>d</w:t>
-      </w:r>
-      <w:r>
-        <w:rPr>
-          <w:rStyle w:val="Hyperlink"/>
-        </w:rPr>
-        <w:t xml:space="preserve">it Innovations, </w:t>
-      </w:r>
-      <w:proofErr w:type="spellStart"/>
-      <w:r>
-        <w:rPr>
-          <w:rStyle w:val="Hyperlink"/>
-        </w:rPr>
-        <w:t>Tenkasi</w:t>
-      </w:r>
-      <w:proofErr w:type="spellEnd"/>
-      <w:r>
-        <w:rPr>
-          <w:rStyle w:val="Hyperlink"/>
-        </w:rPr>
-        <w:t>, India</w:t>
-      </w:r>
-      <w:r>
-        <w:fldChar w:fldCharType="end"/>
-      </w:r>
+      <w:hyperlink r:id="rId17" w:history="1">
+        <w:r>
+          <w:rPr>
+            <w:rStyle w:val="Hyperlink"/>
+          </w:rPr>
+          <w:t>Ka</w:t>
+        </w:r>
+        <w:r>
+          <w:rPr>
+            <w:rStyle w:val="Hyperlink"/>
+          </w:rPr>
+          <w:t>d</w:t>
+        </w:r>
+        <w:r>
+          <w:rPr>
+            <w:rStyle w:val="Hyperlink"/>
+          </w:rPr>
+          <w:t>it Innovations, Tenkasi, India</w:t>
+        </w:r>
+      </w:hyperlink>
       <w:r>
         <w:rPr>
           <w:bCs/>
@@ -660,7 +824,13 @@
         <w:rPr>
           <w:b/>
         </w:rPr>
-        <w:t xml:space="preserve">                                                                  Mar 2025 – Present</w:t>
+        <w:t xml:space="preserve">                                                                Mar 2025 – </w:t>
+      </w:r>
+      <w:r>
+        <w:rPr>
+          <w:b/>
+        </w:rPr>
+        <w:t>Nov 2025</w:t>
       </w:r>
     </w:p>
     <w:p>
@@ -678,23 +848,7 @@
           <w:b/>
           <w:bCs/>
         </w:rPr>
-        <w:t xml:space="preserve"> Protein Vector </w:t>
-      </w:r>
-      <w:proofErr w:type="gramStart"/>
-      <w:r>
-        <w:rPr>
-          <w:b/>
-          <w:bCs/>
-        </w:rPr>
-        <w:t>Search :</w:t>
-      </w:r>
-      <w:proofErr w:type="gramEnd"/>
-      <w:r>
-        <w:rPr>
-          <w:b/>
-          <w:bCs/>
-        </w:rPr>
-        <w:t xml:space="preserve"> </w:t>
+        <w:t xml:space="preserve"> Protein Vector Search : </w:t>
       </w:r>
       <w:r>
         <w:t>Designed and implemented an AI-powered protein search engine using Neo4j vector databases to perform similarity-based retrieval, integrating metadata from multiple protein databases to map sequences and identify relevant matches, including detailed annotation of post-translational modifications (PTMs).</w:t>
@@ -718,15 +872,7 @@
         <w:t>CCTV Attendance Monitoring System</w:t>
       </w:r>
       <w:r>
-        <w:t xml:space="preserve">: Built a real-time attendance and security monitoring solution using RTSP camera feeds with on-device motion detection. Integrated WebSocket triggers to capture events, applied YOLO for person detection and </w:t>
-      </w:r>
-      <w:proofErr w:type="spellStart"/>
-      <w:r>
-        <w:t>InsightFace</w:t>
-      </w:r>
-      <w:proofErr w:type="spellEnd"/>
-      <w:r>
-        <w:t xml:space="preserve"> facial embeddings for identity recognition, and logged verified entries into PostgreSQL for attendance tracking and auditing.</w:t>
+        <w:t>: Built a real-time attendance and security monitoring solution using RTSP camera feeds with on-device motion detection. Integrated WebSocket triggers to capture events, applied YOLO for person detection and InsightFace facial embeddings for identity recognition, and logged verified entries into PostgreSQL for attendance tracking and auditing.</w:t>
       </w:r>
     </w:p>
     <w:p>
@@ -740,7 +886,144 @@
         <w:jc w:val="both"/>
       </w:pPr>
       <w:r>
-        <w:t>Deployed a Kubeflow pipeline for fine-tuning a large language model, and published the model to both GCP AI Repository and Hugging Face for production-ready access.</w:t>
+        <w:t>Deployed the application</w:t>
+      </w:r>
+      <w:r>
+        <w:t>s</w:t>
+      </w:r>
+      <w:r>
+        <w:t xml:space="preserve"> on AWS, leveraging services such as EC2, S3,</w:t>
+      </w:r>
+      <w:r>
+        <w:t xml:space="preserve"> EKS</w:t>
+      </w:r>
+      <w:r>
+        <w:t xml:space="preserve"> and Lambda to ensure scalable performance and reliability for processing large biological datasets in a cloud-native environment.</w:t>
+      </w:r>
+    </w:p>
+    <w:p>
+      <w:pPr>
+        <w:spacing w:after="0" w:line="259" w:lineRule="auto"/>
+        <w:ind w:left="2127" w:hanging="2127"/>
+        <w:jc w:val="both"/>
+        <w:rPr>
+          <w:b/>
+        </w:rPr>
+      </w:pPr>
+      <w:r>
+        <w:rPr>
+          <w:b/>
+        </w:rPr>
+        <w:t>Associate Machine Learning Engineer</w:t>
+      </w:r>
+      <w:r>
+        <w:rPr>
+          <w:b/>
+        </w:rPr>
+        <w:t xml:space="preserve"> </w:t>
+      </w:r>
+      <w:r>
+        <w:rPr>
+          <w:bCs/>
+        </w:rPr>
+        <w:t>[</w:t>
+      </w:r>
+      <w:hyperlink r:id="rId18" w:history="1">
+        <w:r>
+          <w:rPr>
+            <w:rStyle w:val="Hyperlink"/>
+            <w:bCs/>
+          </w:rPr>
+          <w:t>ISPG Technologies Pvt.Ltd, Kochin, Kerala</w:t>
+        </w:r>
+      </w:hyperlink>
+      <w:r>
+        <w:rPr>
+          <w:bCs/>
+        </w:rPr>
+        <w:t>]</w:t>
+      </w:r>
+      <w:r>
+        <w:rPr>
+          <w:b/>
+        </w:rPr>
+        <w:t xml:space="preserve">                             Dec 2024 – </w:t>
+      </w:r>
+      <w:r>
+        <w:rPr>
+          <w:b/>
+        </w:rPr>
+        <w:t>Mar 2025</w:t>
+      </w:r>
+    </w:p>
+    <w:p>
+      <w:pPr>
+        <w:spacing w:after="0" w:line="259" w:lineRule="auto"/>
+        <w:ind w:left="2127" w:hanging="2127"/>
+        <w:jc w:val="both"/>
+        <w:rPr>
+          <w:b/>
+          <w:bCs/>
+          <w:i/>
+          <w:iCs/>
+          <w:sz w:val="20"/>
+          <w:szCs w:val="20"/>
+        </w:rPr>
+      </w:pPr>
+      <w:r>
+        <w:rPr>
+          <w:b/>
+          <w:bCs/>
+          <w:i/>
+          <w:iCs/>
+          <w:sz w:val="20"/>
+          <w:szCs w:val="20"/>
+        </w:rPr>
+        <w:t>(Intern</w:t>
+      </w:r>
+      <w:r>
+        <w:rPr>
+          <w:b/>
+          <w:bCs/>
+          <w:i/>
+          <w:iCs/>
+          <w:sz w:val="20"/>
+          <w:szCs w:val="20"/>
+        </w:rPr>
+        <w:t>: 7 Months</w:t>
+      </w:r>
+      <w:r>
+        <w:rPr>
+          <w:b/>
+          <w:bCs/>
+          <w:i/>
+          <w:iCs/>
+          <w:sz w:val="20"/>
+          <w:szCs w:val="20"/>
+        </w:rPr>
+        <w:t xml:space="preserve"> → Associate ML Engineer</w:t>
+      </w:r>
+      <w:r>
+        <w:rPr>
+          <w:b/>
+          <w:bCs/>
+          <w:i/>
+          <w:iCs/>
+          <w:sz w:val="20"/>
+          <w:szCs w:val="20"/>
+        </w:rPr>
+        <w:t>: 3 Months</w:t>
+      </w:r>
+      <w:r>
+        <w:rPr>
+          <w:b/>
+          <w:bCs/>
+          <w:i/>
+          <w:iCs/>
+          <w:sz w:val="20"/>
+          <w:szCs w:val="20"/>
+        </w:rPr>
+        <w:t>)</w:t>
       </w:r>
     </w:p>
     <w:p>
@@ -754,160 +1037,14 @@
         <w:jc w:val="both"/>
       </w:pPr>
       <w:r>
-        <w:t>Deployed the application</w:t>
-      </w:r>
-      <w:r>
-        <w:t>s</w:t>
-      </w:r>
-      <w:r>
-        <w:t xml:space="preserve"> on AWS, leveraging services such as EC2, S3,</w:t>
-      </w:r>
-      <w:r>
-        <w:t xml:space="preserve"> EKS</w:t>
-      </w:r>
-      <w:r>
-        <w:t xml:space="preserve"> and Lambda to ensure scalable performance and reliability for processing large biological datasets in a cloud-native environment.</w:t>
-      </w:r>
-    </w:p>
-    <w:p>
-      <w:pPr>
-        <w:spacing w:after="0" w:line="259" w:lineRule="auto"/>
-        <w:ind w:left="2127" w:hanging="2127"/>
-        <w:jc w:val="both"/>
-        <w:rPr>
-          <w:b/>
-        </w:rPr>
-      </w:pPr>
-      <w:r>
-        <w:rPr>
-          <w:b/>
-        </w:rPr>
-        <w:t>Associate Machine Learning Engineer</w:t>
-      </w:r>
-      <w:r>
-        <w:rPr>
-          <w:b/>
-        </w:rPr>
-        <w:t xml:space="preserve"> </w:t>
-      </w:r>
-      <w:r>
-        <w:rPr>
-          <w:bCs/>
-        </w:rPr>
-        <w:t>[</w:t>
-      </w:r>
-      <w:hyperlink r:id="rId16" w:history="1">
-        <w:r>
-          <w:rPr>
-            <w:rStyle w:val="Hyperlink"/>
-            <w:bCs/>
-          </w:rPr>
-          <w:t xml:space="preserve">ISPG Technologies </w:t>
-        </w:r>
-        <w:proofErr w:type="spellStart"/>
-        <w:r>
-          <w:rPr>
-            <w:rStyle w:val="Hyperlink"/>
-            <w:bCs/>
-          </w:rPr>
-          <w:t>Pvt.Ltd</w:t>
-        </w:r>
-        <w:proofErr w:type="spellEnd"/>
-        <w:r>
-          <w:rPr>
-            <w:rStyle w:val="Hyperlink"/>
-            <w:bCs/>
-          </w:rPr>
-          <w:t>, Kochin, Kerala</w:t>
-        </w:r>
-      </w:hyperlink>
-      <w:r>
-        <w:rPr>
-          <w:bCs/>
-        </w:rPr>
-        <w:t>]</w:t>
-      </w:r>
-      <w:r>
-        <w:rPr>
-          <w:b/>
-        </w:rPr>
-        <w:t xml:space="preserve">                             Dec 2024 – </w:t>
-      </w:r>
-      <w:r>
-        <w:rPr>
-          <w:b/>
-        </w:rPr>
-        <w:t>Mar 2025</w:t>
-      </w:r>
-    </w:p>
-    <w:p>
-      <w:pPr>
-        <w:spacing w:after="0" w:line="259" w:lineRule="auto"/>
-        <w:ind w:left="2127" w:hanging="2127"/>
-        <w:jc w:val="both"/>
-        <w:rPr>
-          <w:b/>
-          <w:bCs/>
-          <w:i/>
-          <w:iCs/>
-          <w:sz w:val="20"/>
-          <w:szCs w:val="20"/>
-        </w:rPr>
-      </w:pPr>
-      <w:r>
-        <w:rPr>
-          <w:b/>
-          <w:bCs/>
-          <w:i/>
-          <w:iCs/>
-          <w:sz w:val="20"/>
-          <w:szCs w:val="20"/>
-        </w:rPr>
-        <w:t>(Intern</w:t>
-      </w:r>
-      <w:r>
-        <w:rPr>
-          <w:b/>
-          <w:bCs/>
-          <w:i/>
-          <w:iCs/>
-          <w:sz w:val="20"/>
-          <w:szCs w:val="20"/>
-        </w:rPr>
-        <w:t>: 7 Months</w:t>
-      </w:r>
-      <w:r>
-        <w:rPr>
-          <w:b/>
-          <w:bCs/>
-          <w:i/>
-          <w:iCs/>
-          <w:sz w:val="20"/>
-          <w:szCs w:val="20"/>
-        </w:rPr>
-        <w:t xml:space="preserve"> → Associate ML Engineer</w:t>
-      </w:r>
-      <w:r>
-        <w:rPr>
-          <w:b/>
-          <w:bCs/>
-          <w:i/>
-          <w:iCs/>
-          <w:sz w:val="20"/>
-          <w:szCs w:val="20"/>
-        </w:rPr>
-        <w:t>: 3 Months</w:t>
-      </w:r>
-      <w:r>
-        <w:rPr>
-          <w:b/>
-          <w:bCs/>
-          <w:i/>
-          <w:iCs/>
-          <w:sz w:val="20"/>
-          <w:szCs w:val="20"/>
-        </w:rPr>
-        <w:t>)</w:t>
+        <w:rPr>
+          <w:b/>
+          <w:bCs/>
+        </w:rPr>
+        <w:t>RAG-Based Product User-Manual Chatbot (Development)</w:t>
+      </w:r>
+      <w:r>
+        <w:t>: Created a RAG-based product manual chatbot API by crawling and scraping over 5000 websites using Selenium, stored embeddings in Mongo-VectorSearch, and structured the workflow using LangGraph with tools and agents for particular sections.</w:t>
       </w:r>
     </w:p>
     <w:p>
@@ -925,26 +1062,14 @@
           <w:b/>
           <w:bCs/>
         </w:rPr>
-        <w:t>RAG-Based Product User-Manual Chatbot (Development)</w:t>
-      </w:r>
-      <w:r>
-        <w:t>: Created a RAG-based product manual chatbot API by crawling and scraping over 5000 websites using Selenium, stored embeddings in Mongo-</w:t>
-      </w:r>
-      <w:proofErr w:type="spellStart"/>
-      <w:r>
-        <w:t>VectorSearch</w:t>
-      </w:r>
-      <w:proofErr w:type="spellEnd"/>
-      <w:r>
-        <w:t xml:space="preserve">, and structured the workflow using </w:t>
-      </w:r>
-      <w:proofErr w:type="spellStart"/>
-      <w:r>
-        <w:t>LangGraph</w:t>
-      </w:r>
-      <w:proofErr w:type="spellEnd"/>
-      <w:r>
-        <w:t xml:space="preserve"> with tools and agents for particular sections.</w:t>
+        <w:t>AI Chatbot Workflow with LangGraph Agents &amp; AWS (Pre-Production):</w:t>
+      </w:r>
+      <w:r>
+        <w:t xml:space="preserve"> Developing a product with a structured workflow for an AI chatbot using LangGraph tools and agents, enabling efficient, task-specific interactions by automating responses and decision-making processes, improving user experience and achieving accuracy levels </w:t>
+      </w:r>
+      <w:r>
+        <w:lastRenderedPageBreak/>
+        <w:t>of over 70% compared to manual flow approaches. The solution features a centralized chatbot with an admin dashboard for controlling and customizing functionalities.</w:t>
       </w:r>
     </w:p>
     <w:p>
@@ -962,34 +1087,10 @@
           <w:b/>
           <w:bCs/>
         </w:rPr>
-        <w:t xml:space="preserve">AI Chatbot Workflow with </w:t>
-      </w:r>
-      <w:proofErr w:type="spellStart"/>
-      <w:r>
-        <w:rPr>
-          <w:b/>
-          <w:bCs/>
-        </w:rPr>
-        <w:t>LangGraph</w:t>
-      </w:r>
-      <w:proofErr w:type="spellEnd"/>
-      <w:r>
-        <w:rPr>
-          <w:b/>
-          <w:bCs/>
-        </w:rPr>
-        <w:t xml:space="preserve"> Agents &amp; AWS (Pre-Production):</w:t>
-      </w:r>
-      <w:r>
-        <w:t xml:space="preserve"> Developing a product with a structured workflow for an AI chatbot using </w:t>
-      </w:r>
-      <w:proofErr w:type="spellStart"/>
-      <w:r>
-        <w:t>LangGraph</w:t>
-      </w:r>
-      <w:proofErr w:type="spellEnd"/>
-      <w:r>
-        <w:t xml:space="preserve"> tools and agents, enabling efficient, task-specific interactions by automating responses and decision-making processes, improving user experience and achieving accuracy levels of over 70% compared to manual flow approaches. The solution features a centralized chatbot with an admin dashboard for controlling and customizing functionalities.</w:t>
+        <w:t>RAG Technology Integration (Development):</w:t>
+      </w:r>
+      <w:r>
+        <w:t xml:space="preserve"> Developed and integrated Database Retrieval-Augmented Generation (RAG) into the CRM database, enabling seamless translation of user NLP queries into Cypher queries (Graph DB) and converting Cypher responses into human-readable formats. Implemented restricted delete, create, and update operations. This integration enhanced client interaction and operational efficiency by 40%.</w:t>
       </w:r>
     </w:p>
     <w:p>
@@ -1007,50 +1108,21 @@
           <w:b/>
           <w:bCs/>
         </w:rPr>
-        <w:t>RAG Technology Integration (Development):</w:t>
-      </w:r>
-      <w:r>
-        <w:t xml:space="preserve"> Developed and integrated Database Retrieval-Augmented Generation (RAG) into the CRM database, enabling seamless translation of user NLP queries into Cypher queries (Graph DB) and converting Cypher responses into human-readable formats. Implemented restricted delete, create, and update operations. This integration enhanced client interaction and operational efficiency by 40%.</w:t>
-      </w:r>
-    </w:p>
-    <w:p>
-      <w:pPr>
-        <w:numPr>
-          <w:ilvl w:val="0"/>
-          <w:numId w:val="5"/>
-        </w:numPr>
+        <w:t>AI-Based E-Commerce Query System (Production):</w:t>
+      </w:r>
+      <w:r>
+        <w:t xml:space="preserve"> Designed and developed two AI-based e-commerce query systems and an admin dashboard for cost and query analysis using MongoDB VectorSearch for automobile spare parts and jewelry retailers. Implemented AI-driven search systems that enhanced customer experience with fast, accurate queries and natural language processing by 200ms. Integrated advanced search and AI recommendations, improving user experience by </w:t>
+      </w:r>
+      <w:r>
+        <w:t>5</w:t>
+      </w:r>
+      <w:r>
+        <w:t>0% and driving sales.</w:t>
+      </w:r>
+    </w:p>
+    <w:p>
+      <w:pPr>
         <w:spacing w:after="0"/>
-        <w:ind w:left="631" w:hanging="360"/>
-        <w:jc w:val="both"/>
-      </w:pPr>
-      <w:r>
-        <w:rPr>
-          <w:b/>
-          <w:bCs/>
-        </w:rPr>
-        <w:t>AI-Based E-Commerce Query System (Production):</w:t>
-      </w:r>
-      <w:r>
-        <w:t xml:space="preserve"> Designed and developed two AI-based e-commerce query systems and an admin dashboard for cost and query analysis using MongoDB </w:t>
-      </w:r>
-      <w:proofErr w:type="spellStart"/>
-      <w:r>
-        <w:t>VectorSearch</w:t>
-      </w:r>
-      <w:proofErr w:type="spellEnd"/>
-      <w:r>
-        <w:t xml:space="preserve"> for automobile spare parts and jewelry retailers. Implemented AI-driven search systems that enhanced customer experience with fast, accurate queries and natural language processing by 200ms. Integrated advanced search and AI recommendations, improving user experience by </w:t>
-      </w:r>
-      <w:r>
-        <w:t>5</w:t>
-      </w:r>
-      <w:r>
-        <w:t>0% and driving sales.</w:t>
-      </w:r>
-    </w:p>
-    <w:p>
-      <w:pPr>
-        <w:spacing w:after="0"/>
         <w:rPr>
           <w:lang w:val="en-IN"/>
         </w:rPr>
@@ -1083,21 +1155,14 @@
         <w:rPr>
           <w:lang w:val="en-IN"/>
         </w:rPr>
-        <w:t xml:space="preserve">MK Labels, </w:t>
-      </w:r>
-      <w:proofErr w:type="gramStart"/>
-      <w:r>
-        <w:rPr>
+        <w:t>MK Labels, Chennai</w:t>
+      </w:r>
+      <w:r>
+        <w:rPr>
+          <w:b/>
+          <w:bCs/>
           <w:lang w:val="en-IN"/>
         </w:rPr>
-        <w:t>Chennai</w:t>
-      </w:r>
-      <w:r>
-        <w:rPr>
-          <w:b/>
-          <w:bCs/>
-          <w:lang w:val="en-IN"/>
-        </w:rPr>
         <w:t>]</w:t>
       </w:r>
       <w:r>
@@ -1110,14 +1175,7 @@
         <w:rPr>
           <w:b/>
         </w:rPr>
-        <w:t xml:space="preserve">  </w:t>
-      </w:r>
-      <w:proofErr w:type="gramEnd"/>
-      <w:r>
-        <w:rPr>
-          <w:b/>
-        </w:rPr>
-        <w:t xml:space="preserve">                                                                             May 2021 – Jul 2022</w:t>
+        <w:t xml:space="preserve">                                                                               May 2021 – Jul 2022</w:t>
       </w:r>
     </w:p>
     <w:p>
@@ -1227,18 +1285,6 @@
     </w:p>
     <w:p>
       <w:pPr>
-        <w:spacing w:after="0"/>
-        <w:ind w:left="0" w:firstLine="0"/>
-        <w:jc w:val="both"/>
-        <w:rPr>
-          <w:sz w:val="8"/>
-          <w:szCs w:val="8"/>
-          <w:lang w:val="en-IN"/>
-        </w:rPr>
-      </w:pPr>
-    </w:p>
-    <w:p>
-      <w:pPr>
         <w:spacing w:after="0" w:line="259" w:lineRule="auto"/>
         <w:ind w:left="0" w:firstLine="0"/>
         <w:jc w:val="both"/>
@@ -1258,46 +1304,12 @@
           <w:bCs/>
         </w:rPr>
       </w:pPr>
-    </w:p>
-    <w:p>
-      <w:pPr>
-        <w:spacing w:after="0" w:line="259" w:lineRule="auto"/>
-        <w:ind w:left="0" w:firstLine="0"/>
-        <w:jc w:val="both"/>
-        <w:rPr>
-          <w:b/>
-          <w:bCs/>
-        </w:rPr>
-      </w:pPr>
-    </w:p>
-    <w:p>
-      <w:pPr>
-        <w:spacing w:after="0" w:line="259" w:lineRule="auto"/>
-        <w:ind w:left="0" w:firstLine="0"/>
-        <w:jc w:val="both"/>
-        <w:rPr>
-          <w:b/>
-          <w:bCs/>
-        </w:rPr>
-      </w:pPr>
-    </w:p>
-    <w:p>
-      <w:pPr>
-        <w:spacing w:after="0" w:line="259" w:lineRule="auto"/>
-        <w:ind w:left="0" w:firstLine="0"/>
-        <w:jc w:val="both"/>
-        <w:rPr>
-          <w:b/>
-          <w:bCs/>
-        </w:rPr>
-      </w:pPr>
       <w:r>
         <w:rPr>
           <w:b/>
           <w:bCs/>
           <w:noProof/>
         </w:rPr>
-        <w:lastRenderedPageBreak/>
         <mc:AlternateContent>
           <mc:Choice Requires="wpi">
             <w:drawing>
@@ -1316,7 +1328,7 @@
                 <wp:cNvGraphicFramePr/>
                 <a:graphic xmlns:a="http://schemas.openxmlformats.org/drawingml/2006/main">
                   <a:graphicData uri="http://schemas.microsoft.com/office/word/2010/wordprocessingInk">
-                    <w14:contentPart bwMode="auto" r:id="rId17">
+                    <w14:contentPart bwMode="auto" r:id="rId19">
                       <w14:nvContentPartPr>
                         <w14:cNvContentPartPr/>
                       </w14:nvContentPartPr>
@@ -1352,7 +1364,7 @@
                 <o:lock v:ext="edit" aspectratio="t"/>
               </v:shapetype>
               <v:shape id="Ink 3" o:spid="_x0000_s1026" type="#_x0000_t75" style="position:absolute;margin-left:.25pt;margin-top:12.55pt;width:520.25pt;height:.75pt;z-index:251659264;visibility:visible;mso-wrap-style:square;mso-wrap-distance-left:9pt;mso-wrap-distance-top:0;mso-wrap-distance-right:9pt;mso-wrap-distance-bottom:0;mso-position-horizontal:absolute;mso-position-horizontal-relative:text;mso-position-vertical:absolute;mso-position-vertical-relative:text" o:gfxdata="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">
-                <v:imagedata r:id="rId19" o:title=""/>
+                <v:imagedata r:id="rId20" o:title=""/>
               </v:shape>
             </w:pict>
           </mc:Fallback>
@@ -1372,19 +1384,11 @@
         <w:ind w:left="-5"/>
         <w:jc w:val="both"/>
       </w:pPr>
-      <w:proofErr w:type="spellStart"/>
-      <w:r>
-        <w:rPr>
-          <w:b/>
-        </w:rPr>
-        <w:t>Bharathiar</w:t>
-      </w:r>
-      <w:proofErr w:type="spellEnd"/>
-      <w:r>
-        <w:rPr>
-          <w:b/>
-        </w:rPr>
-        <w:t xml:space="preserve"> University, </w:t>
+      <w:r>
+        <w:rPr>
+          <w:b/>
+        </w:rPr>
+        <w:t xml:space="preserve">Bharathiar University, </w:t>
       </w:r>
       <w:r>
         <w:rPr>
@@ -1690,7 +1694,7 @@
                 <wp:cNvGraphicFramePr/>
                 <a:graphic xmlns:a="http://schemas.openxmlformats.org/drawingml/2006/main">
                   <a:graphicData uri="http://schemas.microsoft.com/office/word/2010/wordprocessingInk">
-                    <w14:contentPart bwMode="auto" r:id="rId20">
+                    <w14:contentPart bwMode="auto" r:id="rId21">
                       <w14:nvContentPartPr>
                         <w14:cNvContentPartPr/>
                       </w14:nvContentPartPr>
@@ -1707,7 +1711,7 @@
           <mc:Fallback>
             <w:pict>
               <v:shape w14:anchorId="6D3331C7" id="Ink 4" o:spid="_x0000_s1026" type="#_x0000_t75" style="position:absolute;margin-left:-1.55pt;margin-top:14.4pt;width:525.05pt;height:.75pt;z-index:251660288;visibility:visible;mso-wrap-style:square;mso-wrap-distance-left:9pt;mso-wrap-distance-top:0;mso-wrap-distance-right:9pt;mso-wrap-distance-bottom:0;mso-position-horizontal:absolute;mso-position-horizontal-relative:text;mso-position-vertical:absolute;mso-position-vertical-relative:text" o:gfxdata="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">
-                <v:imagedata r:id="rId21" o:title=""/>
+                <v:imagedata r:id="rId22" o:title=""/>
               </v:shape>
             </w:pict>
           </mc:Fallback>
@@ -1742,40 +1746,11 @@
         <w:t xml:space="preserve">                        </w:t>
       </w:r>
       <w:r>
-        <w:t>Python (</w:t>
-      </w:r>
-      <w:proofErr w:type="spellStart"/>
-      <w:r>
-        <w:t>Numpy</w:t>
-      </w:r>
-      <w:proofErr w:type="spellEnd"/>
-      <w:r>
-        <w:t xml:space="preserve">, Pandas, Matplotlib, Seaborn, Scikit-Learn, </w:t>
-      </w:r>
-      <w:proofErr w:type="spellStart"/>
-      <w:r>
-        <w:t>Tensorflow</w:t>
-      </w:r>
-      <w:proofErr w:type="spellEnd"/>
-      <w:r>
-        <w:t xml:space="preserve">, </w:t>
-      </w:r>
-      <w:proofErr w:type="spellStart"/>
-      <w:r>
-        <w:t>Keras</w:t>
-      </w:r>
-      <w:proofErr w:type="spellEnd"/>
-      <w:r>
-        <w:t>, NLTK</w:t>
-      </w:r>
-      <w:r>
-        <w:t xml:space="preserve">, </w:t>
-      </w:r>
-      <w:proofErr w:type="spellStart"/>
-      <w:r>
-        <w:t>Streamlit</w:t>
-      </w:r>
-      <w:proofErr w:type="spellEnd"/>
+        <w:t>Python (Numpy, Pandas, Matplotlib, Seaborn, Scikit-Learn, Tensorflow, Keras, NLTK</w:t>
+      </w:r>
+      <w:r>
+        <w:t>, Streamlit</w:t>
+      </w:r>
       <w:r>
         <w:t xml:space="preserve">, </w:t>
       </w:r>
@@ -1792,23 +1767,13 @@
         <w:t xml:space="preserve"> </w:t>
       </w:r>
       <w:r>
-        <w:t xml:space="preserve">Fast-API, Flask, </w:t>
-      </w:r>
-      <w:proofErr w:type="spellStart"/>
-      <w:r>
-        <w:t>Langchain</w:t>
-      </w:r>
-      <w:proofErr w:type="spellEnd"/>
-      <w:r>
-        <w:t xml:space="preserve">, </w:t>
-      </w:r>
-      <w:proofErr w:type="spellStart"/>
-      <w:r>
-        <w:t>Langgraph</w:t>
-      </w:r>
-      <w:proofErr w:type="spellEnd"/>
+        <w:t>Fast-API, Flask, Langchain, Langgraph</w:t>
+      </w:r>
       <w:r>
         <w:t>, Neo4j</w:t>
+      </w:r>
+      <w:r>
+        <w:t>, Deepeval</w:t>
       </w:r>
     </w:p>
     <w:p>
@@ -1837,13 +1802,13 @@
         <w:t xml:space="preserve">                    </w:t>
       </w:r>
       <w:r>
-        <w:t>Python (Intermediate)</w:t>
+        <w:t xml:space="preserve">Python </w:t>
       </w:r>
       <w:r>
         <w:t>,</w:t>
       </w:r>
       <w:r>
-        <w:t xml:space="preserve"> SQL</w:t>
+        <w:t>SQL</w:t>
       </w:r>
       <w:r>
         <w:t>, Cypher (Neo4J)</w:t>
@@ -1871,12 +1836,14 @@
       </w:r>
       <w:r>
         <w:rPr>
+          <w:b/>
           <w:i/>
         </w:rPr>
         <w:t xml:space="preserve"> </w:t>
       </w:r>
       <w:r>
         <w:rPr>
+          <w:b/>
           <w:i/>
         </w:rPr>
         <w:t xml:space="preserve">   </w:t>
@@ -1921,6 +1888,33 @@
     </w:p>
     <w:p>
       <w:pPr>
+        <w:spacing w:after="0"/>
+        <w:ind w:left="-5"/>
+        <w:jc w:val="both"/>
+      </w:pPr>
+      <w:r>
+        <w:rPr>
+          <w:b/>
+          <w:i/>
+        </w:rPr>
+        <w:t xml:space="preserve">Artificial Intelligence    </w:t>
+      </w:r>
+      <w:r>
+        <w:t xml:space="preserve">AI model Traning, FineTuning, AI Evaluation, HybridRetrieval Augement Genreration (RAG),  </w:t>
+      </w:r>
+    </w:p>
+    <w:p>
+      <w:pPr>
+        <w:spacing w:after="0"/>
+        <w:ind w:left="-5"/>
+        <w:jc w:val="both"/>
+      </w:pPr>
+      <w:r>
+        <w:t xml:space="preserve">                                         VLLM, AI Model serving, Multi Agent Orchestration, Harness Engineering                                                                                           </w:t>
+      </w:r>
+    </w:p>
+    <w:p>
+      <w:pPr>
         <w:spacing w:after="0" w:line="259" w:lineRule="auto"/>
         <w:ind w:left="0" w:firstLine="0"/>
         <w:jc w:val="both"/>
@@ -1940,13 +1934,8 @@
       <w:r>
         <w:t xml:space="preserve">                              </w:t>
       </w:r>
-      <w:proofErr w:type="spellStart"/>
-      <w:r>
-        <w:t>Jupyter</w:t>
-      </w:r>
-      <w:proofErr w:type="spellEnd"/>
-      <w:r>
-        <w:t xml:space="preserve"> Notebook, Arduino IDE, MS Excel, Tableau, VS code</w:t>
+      <w:r>
+        <w:t>Jupyter Notebook, Arduino IDE, MS Excel, Tableau, VS code</w:t>
       </w:r>
       <w:r>
         <w:t>, Postman</w:t>
@@ -1991,27 +1980,14 @@
         </w:rPr>
         <w:t xml:space="preserve"> </w:t>
       </w:r>
-      <w:proofErr w:type="spellStart"/>
-      <w:r>
-        <w:t>Langchain</w:t>
-      </w:r>
-      <w:proofErr w:type="spellEnd"/>
-      <w:r>
-        <w:t>, LLM, Large Language Models, IoT</w:t>
-      </w:r>
-      <w:r>
-        <w:t xml:space="preserve">, </w:t>
-      </w:r>
-      <w:proofErr w:type="spellStart"/>
-      <w:r>
-        <w:t>Onnx</w:t>
-      </w:r>
-      <w:proofErr w:type="spellEnd"/>
-      <w:r>
-        <w:t>, Docker, Kubernetes</w:t>
-      </w:r>
-      <w:r>
-        <w:t>.</w:t>
+      <w:r>
+        <w:t>Langchain, LLM, Large Language Models, IoT</w:t>
+      </w:r>
+      <w:r>
+        <w:t>, Onnx, Docker, Kubernetes</w:t>
+      </w:r>
+      <w:r>
+        <w:t>, Langfuse</w:t>
       </w:r>
     </w:p>
     <w:p>
@@ -2024,7 +2000,6 @@
           <w:iCs/>
         </w:rPr>
       </w:pPr>
-      <w:proofErr w:type="spellStart"/>
       <w:r>
         <w:rPr>
           <w:b/>
@@ -2034,7 +2009,6 @@
         </w:rPr>
         <w:t>Pipleines</w:t>
       </w:r>
-      <w:proofErr w:type="spellEnd"/>
       <w:r>
         <w:rPr>
           <w:b/>
@@ -2044,50 +2018,8 @@
         </w:rPr>
         <w:tab/>
       </w:r>
-      <w:proofErr w:type="spellStart"/>
-      <w:r>
-        <w:t>Kedro</w:t>
-      </w:r>
-      <w:proofErr w:type="spellEnd"/>
-      <w:r>
-        <w:t xml:space="preserve"> </w:t>
-      </w:r>
-      <w:r>
-        <w:t>Pipelines</w:t>
-      </w:r>
-      <w:r>
-        <w:t xml:space="preserve">, </w:t>
-      </w:r>
-      <w:proofErr w:type="spellStart"/>
-      <w:r>
-        <w:t>Github</w:t>
-      </w:r>
-      <w:proofErr w:type="spellEnd"/>
-      <w:r>
-        <w:t xml:space="preserve"> actions </w:t>
-      </w:r>
-      <w:r>
-        <w:t>Pipelines</w:t>
-      </w:r>
-      <w:r>
-        <w:t xml:space="preserve">, Kubeflow </w:t>
-      </w:r>
-      <w:r>
-        <w:t>Pipelines</w:t>
-      </w:r>
-      <w:r>
-        <w:t xml:space="preserve">, </w:t>
-      </w:r>
-      <w:proofErr w:type="spellStart"/>
-      <w:r>
-        <w:t>S</w:t>
-      </w:r>
-      <w:r>
-        <w:t>agemaker</w:t>
-      </w:r>
-      <w:proofErr w:type="spellEnd"/>
-      <w:r>
-        <w:t xml:space="preserve"> Pipelines</w:t>
+      <w:r>
+        <w:t>Kedro Pipelines, Github actions Pipelines, Kubeflow Pipelines</w:t>
       </w:r>
     </w:p>
     <w:p>
@@ -2124,13 +2056,8 @@
         <w:t>(</w:t>
       </w:r>
       <w:r>
-        <w:t xml:space="preserve">AWS EC2, AWS IAM AWS Bedrock, AWS RDS, AWS </w:t>
-      </w:r>
-      <w:proofErr w:type="spellStart"/>
-      <w:r>
-        <w:t>APIGateway</w:t>
-      </w:r>
-      <w:proofErr w:type="spellEnd"/>
+        <w:t>AWS EC2, AWS IAM AWS Bedrock, AWS RDS, AWS APIGateway</w:t>
+      </w:r>
       <w:r>
         <w:t>,</w:t>
       </w:r>
@@ -2145,15 +2072,10 @@
         <w:t xml:space="preserve">                                      </w:t>
       </w:r>
       <w:r>
-        <w:t xml:space="preserve">AWS </w:t>
-      </w:r>
-      <w:proofErr w:type="spellStart"/>
-      <w:r>
-        <w:t>Sagemaker</w:t>
-      </w:r>
-      <w:proofErr w:type="spellEnd"/>
-      <w:r>
-        <w:t xml:space="preserve"> (Fundamentals), AWS Lambda, AWS S3, AWS ECR</w:t>
+        <w:t xml:space="preserve"> </w:t>
+      </w:r>
+      <w:r>
+        <w:t>AWS Lambda, AWS S3, AWS ECR</w:t>
       </w:r>
       <w:r>
         <w:t>)</w:t>
@@ -2177,670 +2099,8 @@
     </w:p>
     <w:p>
       <w:pPr>
-        <w:spacing w:after="0" w:line="259" w:lineRule="auto"/>
-        <w:ind w:left="2127" w:hanging="2127"/>
-        <w:jc w:val="both"/>
-      </w:pPr>
-    </w:p>
-    <w:p>
-      <w:pPr>
-        <w:pStyle w:val="Heading1"/>
-        <w:ind w:left="-5"/>
-        <w:jc w:val="both"/>
-      </w:pPr>
-      <w:r>
-        <w:rPr>
-          <w:noProof/>
-        </w:rPr>
-        <mc:AlternateContent>
-          <mc:Choice Requires="wpi">
-            <w:drawing>
-              <wp:anchor distT="0" distB="0" distL="114300" distR="114300" simplePos="0" relativeHeight="251661312" behindDoc="0" locked="0" layoutInCell="1" allowOverlap="1" wp14:anchorId="44079DDF" wp14:editId="68D64C3F">
-                <wp:simplePos x="0" y="0"/>
-                <wp:positionH relativeFrom="column">
-                  <wp:posOffset>-30600</wp:posOffset>
-                </wp:positionH>
-                <wp:positionV relativeFrom="paragraph">
-                  <wp:posOffset>189990</wp:posOffset>
-                </wp:positionV>
-                <wp:extent cx="6712200" cy="360"/>
-                <wp:effectExtent l="38100" t="38100" r="31750" b="38100"/>
-                <wp:wrapNone/>
-                <wp:docPr id="1239392847" name="Ink 5"/>
-                <wp:cNvGraphicFramePr/>
-                <a:graphic xmlns:a="http://schemas.openxmlformats.org/drawingml/2006/main">
-                  <a:graphicData uri="http://schemas.microsoft.com/office/word/2010/wordprocessingInk">
-                    <w14:contentPart bwMode="auto" r:id="rId22">
-                      <w14:nvContentPartPr>
-                        <w14:cNvContentPartPr/>
-                      </w14:nvContentPartPr>
-                      <w14:xfrm>
-                        <a:off x="0" y="0"/>
-                        <a:ext cx="6712200" cy="360"/>
-                      </w14:xfrm>
-                    </w14:contentPart>
-                  </a:graphicData>
-                </a:graphic>
-              </wp:anchor>
-            </w:drawing>
-          </mc:Choice>
-          <mc:Fallback>
-            <w:pict>
-              <v:shape w14:anchorId="5D3190D0" id="Ink 5" o:spid="_x0000_s1026" type="#_x0000_t75" style="position:absolute;margin-left:-2.75pt;margin-top:14.6pt;width:529.2pt;height:.75pt;z-index:251661312;visibility:visible;mso-wrap-style:square;mso-wrap-distance-left:9pt;mso-wrap-distance-top:0;mso-wrap-distance-right:9pt;mso-wrap-distance-bottom:0;mso-position-horizontal:absolute;mso-position-horizontal-relative:text;mso-position-vertical:absolute;mso-position-vertical-relative:text" o:gfxdata="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">
-                <v:imagedata r:id="rId23" o:title=""/>
-              </v:shape>
-            </w:pict>
-          </mc:Fallback>
-        </mc:AlternateContent>
-      </w:r>
-      <w:r>
-        <w:t>PROJECT</w:t>
-      </w:r>
-      <w:r>
-        <w:t>S</w:t>
-      </w:r>
-    </w:p>
-    <w:p>
-      <w:pPr>
-        <w:jc w:val="both"/>
-      </w:pPr>
-      <w:proofErr w:type="spellStart"/>
-      <w:r>
-        <w:rPr>
-          <w:b/>
-        </w:rPr>
-        <w:t>Omnibot</w:t>
-      </w:r>
-      <w:proofErr w:type="spellEnd"/>
-      <w:r>
-        <w:rPr>
-          <w:b/>
-        </w:rPr>
-        <w:t xml:space="preserve"> - </w:t>
-      </w:r>
-      <w:r>
-        <w:rPr>
-          <w:b/>
-        </w:rPr>
-        <w:t>LLM RAG Retrieval</w:t>
-      </w:r>
-      <w:r>
-        <w:rPr>
-          <w:b/>
-        </w:rPr>
-        <w:t xml:space="preserve">, </w:t>
-      </w:r>
-      <w:r>
-        <w:t>[</w:t>
-      </w:r>
-      <w:proofErr w:type="spellStart"/>
-      <w:r>
-        <w:t>Langchain</w:t>
-      </w:r>
-      <w:proofErr w:type="spellEnd"/>
-      <w:r>
-        <w:t>, LLM, Genai, Word Embeddings] [</w:t>
-      </w:r>
-      <w:hyperlink r:id="rId24" w:history="1">
-        <w:r>
-          <w:rPr>
-            <w:rStyle w:val="Hyperlink"/>
-            <w:b/>
-            <w:bCs/>
-          </w:rPr>
-          <w:t>Link</w:t>
-        </w:r>
-      </w:hyperlink>
-      <w:r>
-        <w:t>]</w:t>
-      </w:r>
-      <w:r>
-        <w:rPr>
-          <w:b/>
-        </w:rPr>
-        <w:t xml:space="preserve">                         </w:t>
-      </w:r>
-      <w:r>
-        <w:rPr>
-          <w:b/>
-        </w:rPr>
-        <w:t xml:space="preserve">     </w:t>
-      </w:r>
-      <w:r>
-        <w:rPr>
-          <w:b/>
-        </w:rPr>
-        <w:t xml:space="preserve">   </w:t>
-      </w:r>
-      <w:r>
-        <w:rPr>
-          <w:b/>
-        </w:rPr>
-        <w:t xml:space="preserve"> </w:t>
-      </w:r>
-      <w:r>
-        <w:rPr>
-          <w:b/>
-        </w:rPr>
-        <w:t xml:space="preserve">        </w:t>
-      </w:r>
-      <w:r>
-        <w:rPr>
-          <w:b/>
-        </w:rPr>
-        <w:t>March</w:t>
-      </w:r>
-      <w:r>
-        <w:t xml:space="preserve"> </w:t>
-      </w:r>
-      <w:r>
-        <w:rPr>
-          <w:b/>
-          <w:bCs/>
-        </w:rPr>
-        <w:t>2024</w:t>
-      </w:r>
-    </w:p>
-    <w:p>
-      <w:pPr>
-        <w:numPr>
-          <w:ilvl w:val="0"/>
-          <w:numId w:val="5"/>
-        </w:numPr>
         <w:spacing w:after="0"/>
-        <w:ind w:left="631" w:hanging="360"/>
-        <w:jc w:val="both"/>
-      </w:pPr>
-      <w:r>
-        <w:t xml:space="preserve">Developed a streamlined Vector </w:t>
-      </w:r>
-      <w:r>
-        <w:t>Storage</w:t>
-      </w:r>
-      <w:r>
-        <w:t xml:space="preserve"> leveraging Google word embeddings, resulting in a notable 50% reduction in processing time by harnessing Google's backend infrastructure for execution.</w:t>
-      </w:r>
-    </w:p>
-    <w:p>
-      <w:pPr>
-        <w:numPr>
-          <w:ilvl w:val="0"/>
-          <w:numId w:val="5"/>
-        </w:numPr>
-        <w:spacing w:after="0"/>
-        <w:ind w:left="631" w:hanging="360"/>
-        <w:jc w:val="both"/>
-      </w:pPr>
-      <w:r>
-        <w:t xml:space="preserve">Implemented </w:t>
-      </w:r>
-      <w:proofErr w:type="spellStart"/>
-      <w:r>
-        <w:t>Faiss</w:t>
-      </w:r>
-      <w:proofErr w:type="spellEnd"/>
-      <w:r>
-        <w:t xml:space="preserve"> document retrieval from Meta for efficient text data extraction, prioritizing speed and enabling rapid nearest neighbor search and clustering operations. Furthermore, integrated advanced language models such as GEMMA and Gemini with </w:t>
-      </w:r>
-      <w:proofErr w:type="spellStart"/>
-      <w:r>
-        <w:t>Faiss</w:t>
-      </w:r>
-      <w:proofErr w:type="spellEnd"/>
-      <w:r>
-        <w:t xml:space="preserve"> to ensure superior performance and accuracy in data processing tasks.</w:t>
-      </w:r>
-    </w:p>
-    <w:p>
-      <w:pPr>
-        <w:numPr>
-          <w:ilvl w:val="0"/>
-          <w:numId w:val="5"/>
-        </w:numPr>
-        <w:spacing w:after="0"/>
-        <w:ind w:left="631" w:hanging="360"/>
-        <w:jc w:val="both"/>
-      </w:pPr>
-      <w:r>
-        <w:t>Deployed the system on Amazon EC2 Ubuntu AMI (Amazon Machine Image), ensuring scalability and reliability while leveraging Amazon's robust cloud infrastructure for seamless operation and maintenance.</w:t>
-      </w:r>
-    </w:p>
-    <w:p>
-      <w:pPr>
-        <w:spacing w:after="33"/>
-        <w:ind w:left="-5"/>
-        <w:jc w:val="both"/>
-      </w:pPr>
-      <w:r>
-        <w:rPr>
-          <w:b/>
-        </w:rPr>
-        <w:t>HUMAN VS AI TEXT CLASSIFICATION</w:t>
-      </w:r>
-      <w:r>
-        <w:rPr>
-          <w:b/>
-        </w:rPr>
-        <w:t>,</w:t>
-      </w:r>
-      <w:r>
-        <w:t xml:space="preserve"> </w:t>
-      </w:r>
-      <w:r>
-        <w:t>[NLP, LLM, BERT, Transformers, Deep Learning] [</w:t>
-      </w:r>
-      <w:hyperlink r:id="rId25" w:history="1">
-        <w:r>
-          <w:rPr>
-            <w:rStyle w:val="Hyperlink"/>
-            <w:b/>
-            <w:bCs/>
-          </w:rPr>
-          <w:t>Link</w:t>
-        </w:r>
-      </w:hyperlink>
-      <w:r>
-        <w:t xml:space="preserve">]                         </w:t>
-      </w:r>
-      <w:r>
-        <w:rPr>
-          <w:b/>
-        </w:rPr>
-        <w:t>January 2024</w:t>
-      </w:r>
-    </w:p>
-    <w:p>
-      <w:pPr>
-        <w:numPr>
-          <w:ilvl w:val="0"/>
-          <w:numId w:val="5"/>
-        </w:numPr>
-        <w:ind w:left="631" w:hanging="360"/>
-        <w:jc w:val="both"/>
-      </w:pPr>
-      <w:r>
-        <w:t xml:space="preserve">Implemented </w:t>
-      </w:r>
-      <w:proofErr w:type="spellStart"/>
-      <w:r>
-        <w:t>XLMBert</w:t>
-      </w:r>
-      <w:proofErr w:type="spellEnd"/>
-      <w:r>
-        <w:t xml:space="preserve">, a variant of the BERT architecture, using the </w:t>
-      </w:r>
-      <w:proofErr w:type="spellStart"/>
-      <w:r>
-        <w:t>Keras</w:t>
-      </w:r>
-      <w:proofErr w:type="spellEnd"/>
-      <w:r>
-        <w:t xml:space="preserve"> NLP framework for natural language processing tasks, capable of handling more than 100,000 instances.</w:t>
-      </w:r>
-    </w:p>
-    <w:p>
-      <w:pPr>
-        <w:numPr>
-          <w:ilvl w:val="0"/>
-          <w:numId w:val="5"/>
-        </w:numPr>
-        <w:ind w:left="631" w:hanging="360"/>
-        <w:jc w:val="both"/>
-      </w:pPr>
-      <w:r>
-        <w:t xml:space="preserve">Conducted fine-tuning of the model </w:t>
-      </w:r>
-      <w:r>
-        <w:t xml:space="preserve">for </w:t>
-      </w:r>
-      <w:r>
-        <w:t>Adaptation to Domain and Data</w:t>
-      </w:r>
-      <w:r>
-        <w:t xml:space="preserve"> </w:t>
-      </w:r>
-      <w:r>
-        <w:t xml:space="preserve">using a custom classification dataset, employing techniques such as </w:t>
-      </w:r>
-      <w:proofErr w:type="spellStart"/>
-      <w:r>
-        <w:t>stopword</w:t>
-      </w:r>
-      <w:proofErr w:type="spellEnd"/>
-      <w:r>
-        <w:t xml:space="preserve"> removal and word embeddings for preprocessing.</w:t>
-      </w:r>
-    </w:p>
-    <w:p>
-      <w:pPr>
-        <w:numPr>
-          <w:ilvl w:val="0"/>
-          <w:numId w:val="5"/>
-        </w:numPr>
-        <w:ind w:left="631" w:hanging="360"/>
-        <w:jc w:val="both"/>
-      </w:pPr>
-      <w:r>
-        <w:t>Achieved 99% testing accuracy in discerning human-generated text from machine-generated text, demonstrating the model's effectiveness.</w:t>
-      </w:r>
-    </w:p>
-    <w:p>
-      <w:pPr>
-        <w:pStyle w:val="Heading1"/>
-        <w:tabs>
-          <w:tab w:val="center" w:pos="5041"/>
-          <w:tab w:val="center" w:pos="5761"/>
-          <w:tab w:val="right" w:pos="10493"/>
-        </w:tabs>
-        <w:ind w:left="-15" w:firstLine="0"/>
-        <w:jc w:val="both"/>
-      </w:pPr>
-      <w:r>
-        <w:rPr>
-          <w:noProof/>
-        </w:rPr>
-        <mc:AlternateContent>
-          <mc:Choice Requires="wpi">
-            <w:drawing>
-              <wp:anchor distT="0" distB="0" distL="114300" distR="114300" simplePos="0" relativeHeight="251662336" behindDoc="0" locked="0" layoutInCell="1" allowOverlap="1" wp14:anchorId="4E0ECA4E" wp14:editId="6093B880">
-                <wp:simplePos x="0" y="0"/>
-                <wp:positionH relativeFrom="column">
-                  <wp:posOffset>-1539360</wp:posOffset>
-                </wp:positionH>
-                <wp:positionV relativeFrom="paragraph">
-                  <wp:posOffset>283965</wp:posOffset>
-                </wp:positionV>
-                <wp:extent cx="360" cy="360"/>
-                <wp:effectExtent l="38100" t="38100" r="38100" b="38100"/>
-                <wp:wrapNone/>
-                <wp:docPr id="115898852" name="Ink 6"/>
-                <wp:cNvGraphicFramePr/>
-                <a:graphic xmlns:a="http://schemas.openxmlformats.org/drawingml/2006/main">
-                  <a:graphicData uri="http://schemas.microsoft.com/office/word/2010/wordprocessingInk">
-                    <w14:contentPart bwMode="auto" r:id="rId26">
-                      <w14:nvContentPartPr>
-                        <w14:cNvContentPartPr/>
-                      </w14:nvContentPartPr>
-                      <w14:xfrm>
-                        <a:off x="0" y="0"/>
-                        <a:ext cx="360" cy="360"/>
-                      </w14:xfrm>
-                    </w14:contentPart>
-                  </a:graphicData>
-                </a:graphic>
-              </wp:anchor>
-            </w:drawing>
-          </mc:Choice>
-          <mc:Fallback>
-            <w:pict>
-              <v:shape w14:anchorId="1481AB88" id="Ink 6" o:spid="_x0000_s1026" type="#_x0000_t75" style="position:absolute;margin-left:-121.55pt;margin-top:22pt;width:.75pt;height:.75pt;z-index:251662336;visibility:visible;mso-wrap-style:square;mso-wrap-distance-left:9pt;mso-wrap-distance-top:0;mso-wrap-distance-right:9pt;mso-wrap-distance-bottom:0;mso-position-horizontal:absolute;mso-position-horizontal-relative:text;mso-position-vertical:absolute;mso-position-vertical-relative:text" o:gfxdata="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">
-                <v:imagedata r:id="rId27" o:title=""/>
-              </v:shape>
-            </w:pict>
-          </mc:Fallback>
-        </mc:AlternateContent>
-      </w:r>
-      <w:r>
-        <w:t>MRI Image Enhancer</w:t>
-      </w:r>
-      <w:r>
-        <w:t>,</w:t>
-      </w:r>
-      <w:r>
-        <w:rPr>
-          <w:b w:val="0"/>
-        </w:rPr>
-        <w:t xml:space="preserve"> [Deep Learning, CNN, Image </w:t>
-      </w:r>
-      <w:proofErr w:type="gramStart"/>
-      <w:r>
-        <w:rPr>
-          <w:b w:val="0"/>
-        </w:rPr>
-        <w:t>Processing][</w:t>
-      </w:r>
-      <w:proofErr w:type="gramEnd"/>
-      <w:hyperlink r:id="rId28" w:history="1">
-        <w:r>
-          <w:rPr>
-            <w:rStyle w:val="Hyperlink"/>
-            <w:bCs/>
-          </w:rPr>
-          <w:t>L</w:t>
-        </w:r>
-        <w:r>
-          <w:rPr>
-            <w:rStyle w:val="Hyperlink"/>
-          </w:rPr>
-          <w:t>ink</w:t>
-        </w:r>
-      </w:hyperlink>
-      <w:r>
-        <w:rPr>
-          <w:b w:val="0"/>
-          <w:bCs/>
-        </w:rPr>
-        <w:t>]</w:t>
-      </w:r>
-      <w:r>
-        <w:t xml:space="preserve"> </w:t>
-      </w:r>
-      <w:r>
-        <w:t xml:space="preserve">                                                          December 2023</w:t>
-      </w:r>
-      <w:r>
-        <w:tab/>
-        <w:t xml:space="preserve">                             </w:t>
-      </w:r>
-      <w:r>
-        <w:t xml:space="preserve">  </w:t>
-      </w:r>
-      <w:r>
-        <w:t xml:space="preserve"> </w:t>
-      </w:r>
-    </w:p>
-    <w:p>
-      <w:pPr>
-        <w:numPr>
-          <w:ilvl w:val="0"/>
-          <w:numId w:val="5"/>
-        </w:numPr>
-        <w:spacing w:after="0"/>
-        <w:ind w:left="631" w:hanging="360"/>
-        <w:jc w:val="both"/>
-      </w:pPr>
-      <w:r>
-        <w:t>Implemented TensorFlow's CNN framework to enhance low</w:t>
-      </w:r>
-      <w:r>
-        <w:t xml:space="preserve"> r</w:t>
-      </w:r>
-      <w:r>
-        <w:t>esolution</w:t>
-      </w:r>
-      <w:r>
-        <w:t xml:space="preserve"> </w:t>
-      </w:r>
-      <w:r>
-        <w:t>medical</w:t>
-      </w:r>
-      <w:r>
-        <w:t xml:space="preserve"> </w:t>
-      </w:r>
-      <w:r>
-        <w:t>MRI</w:t>
-      </w:r>
-      <w:r>
-        <w:t xml:space="preserve"> </w:t>
-      </w:r>
-      <w:r>
-        <w:t>images</w:t>
-      </w:r>
-      <w:r>
-        <w:t xml:space="preserve"> </w:t>
-      </w:r>
-      <w:r>
-        <w:t>using</w:t>
-      </w:r>
-      <w:r>
-        <w:t xml:space="preserve"> </w:t>
-      </w:r>
-      <w:r>
-        <w:t>the</w:t>
-      </w:r>
-      <w:r>
-        <w:t xml:space="preserve">       </w:t>
-      </w:r>
-      <w:r>
-        <w:t>FSRCNN model</w:t>
-      </w:r>
-      <w:r>
-        <w:t xml:space="preserve"> </w:t>
-      </w:r>
-      <w:r>
-        <w:t>increased</w:t>
-      </w:r>
-      <w:r>
-        <w:t xml:space="preserve"> </w:t>
-      </w:r>
-      <w:r>
-        <w:t>image</w:t>
-      </w:r>
-      <w:r>
-        <w:t xml:space="preserve"> </w:t>
-      </w:r>
-      <w:r>
-        <w:t>clarity</w:t>
-      </w:r>
-      <w:r>
-        <w:t xml:space="preserve"> </w:t>
-      </w:r>
-      <w:r>
-        <w:t>by</w:t>
-      </w:r>
-      <w:r>
-        <w:t xml:space="preserve"> </w:t>
-      </w:r>
-      <w:r>
-        <w:t>35</w:t>
-      </w:r>
-      <w:r>
-        <w:t>%</w:t>
-      </w:r>
-      <w:r>
-        <w:t xml:space="preserve"> </w:t>
-      </w:r>
-      <w:r>
-        <w:t>enabling</w:t>
-      </w:r>
-      <w:r>
-        <w:t xml:space="preserve"> </w:t>
-      </w:r>
-      <w:r>
-        <w:t>extraction</w:t>
-      </w:r>
-      <w:r>
-        <w:t xml:space="preserve"> o</w:t>
-      </w:r>
-      <w:r>
-        <w:t>f</w:t>
-      </w:r>
-      <w:r>
-        <w:t xml:space="preserve"> </w:t>
-      </w:r>
-      <w:r>
-        <w:t>crucial</w:t>
-      </w:r>
-      <w:r>
-        <w:t xml:space="preserve"> </w:t>
-      </w:r>
-      <w:r>
-        <w:t>details</w:t>
-      </w:r>
-      <w:r>
-        <w:t xml:space="preserve"> </w:t>
-      </w:r>
-      <w:r>
-        <w:t>for</w:t>
-      </w:r>
-      <w:r>
-        <w:t xml:space="preserve"> </w:t>
-      </w:r>
-      <w:r>
-        <w:t>accurate</w:t>
-      </w:r>
-      <w:r>
-        <w:t xml:space="preserve"> </w:t>
-      </w:r>
-      <w:r>
-        <w:t>diagnosis</w:t>
-      </w:r>
-      <w:r>
-        <w:t xml:space="preserve"> </w:t>
-      </w:r>
-      <w:r>
-        <w:t>and</w:t>
-      </w:r>
-      <w:r>
-        <w:t xml:space="preserve"> </w:t>
-      </w:r>
-      <w:r>
-        <w:t>treatment</w:t>
-      </w:r>
-      <w:r>
-        <w:t xml:space="preserve"> </w:t>
-      </w:r>
-      <w:r>
-        <w:t>planning.</w:t>
-      </w:r>
-    </w:p>
-    <w:p>
-      <w:pPr>
-        <w:numPr>
-          <w:ilvl w:val="0"/>
-          <w:numId w:val="5"/>
-        </w:numPr>
-        <w:spacing w:after="0"/>
-        <w:ind w:left="631" w:hanging="360"/>
-        <w:jc w:val="both"/>
-      </w:pPr>
-      <w:r>
-        <w:t xml:space="preserve">Developed a </w:t>
-      </w:r>
-      <w:proofErr w:type="spellStart"/>
-      <w:r>
-        <w:t>Streamlit</w:t>
-      </w:r>
-      <w:proofErr w:type="spellEnd"/>
-      <w:r>
-        <w:t xml:space="preserve"> environment for interactive deployment, facilitating easy input of images and immediate visualization of enhanced outputs. This streamlined workflow led to a 14% improvement in real-time predictions.</w:t>
-      </w:r>
-    </w:p>
-    <w:p>
-      <w:pPr>
-        <w:numPr>
-          <w:ilvl w:val="0"/>
-          <w:numId w:val="5"/>
-        </w:numPr>
-        <w:spacing w:after="0"/>
-        <w:ind w:hanging="360"/>
-        <w:jc w:val="both"/>
-      </w:pPr>
-      <w:r>
-        <w:t xml:space="preserve">The FSRCNN model with PReLU activation performs better compared to bicubic and </w:t>
-      </w:r>
-      <w:proofErr w:type="spellStart"/>
-      <w:r>
-        <w:t>ReLU</w:t>
-      </w:r>
-      <w:proofErr w:type="spellEnd"/>
-      <w:r>
-        <w:t xml:space="preserve"> by 20% and 2%, respectively.</w:t>
-      </w:r>
-    </w:p>
-    <w:p>
-      <w:pPr>
-        <w:spacing w:after="0"/>
+        <w:ind w:left="0" w:firstLine="0"/>
         <w:jc w:val="both"/>
         <w:rPr>
           <w:sz w:val="8"/>
@@ -2889,7 +2149,7 @@
                 <wp:cNvGraphicFramePr/>
                 <a:graphic xmlns:a="http://schemas.openxmlformats.org/drawingml/2006/main">
                   <a:graphicData uri="http://schemas.microsoft.com/office/word/2010/wordprocessingInk">
-                    <w14:contentPart bwMode="auto" r:id="rId29">
+                    <w14:contentPart bwMode="auto" r:id="rId23">
                       <w14:nvContentPartPr>
                         <w14:cNvContentPartPr/>
                       </w14:nvContentPartPr>
@@ -2906,7 +2166,7 @@
           <mc:Fallback>
             <w:pict>
               <v:shape w14:anchorId="2D2C6B1B" id="Ink 5" o:spid="_x0000_s1026" type="#_x0000_t75" style="position:absolute;margin-left:0;margin-top:13.6pt;width:529.2pt;height:.75pt;z-index:251666432;visibility:visible;mso-wrap-style:square;mso-wrap-distance-left:9pt;mso-wrap-distance-top:0;mso-wrap-distance-right:9pt;mso-wrap-distance-bottom:0;mso-position-horizontal:center;mso-position-horizontal-relative:margin;mso-position-vertical:absolute;mso-position-vertical-relative:text" o:gfxdata="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">
-                <v:imagedata r:id="rId23" o:title=""/>
+                <v:imagedata r:id="rId24" o:title=""/>
                 <w10:wrap anchorx="margin"/>
               </v:shape>
             </w:pict>
@@ -5343,6 +4603,7 @@
   <w:style w:type="character" w:default="1" w:styleId="DefaultParagraphFont">
     <w:name w:val="Default Paragraph Font"/>
     <w:uiPriority w:val="1"/>
+    <w:semiHidden/>
     <w:unhideWhenUsed/>
   </w:style>
   <w:style w:type="table" w:default="1" w:styleId="TableNormal">
@@ -5577,59 +4838,6 @@
 </file>
 
 <file path=word/ink/ink5.xml><?xml version="1.0" encoding="utf-8"?>
-<inkml:ink xmlns:inkml="http://www.w3.org/2003/InkML">
-  <inkml:definitions>
-    <inkml:context xml:id="ctx0">
-      <inkml:inkSource xml:id="inkSrc0">
-        <inkml:traceFormat>
-          <inkml:channel name="X" type="integer" min="-2.14748E9" max="2.14748E9" units="cm"/>
-          <inkml:channel name="Y" type="integer" min="-2.14748E9" max="2.14748E9" units="cm"/>
-        </inkml:traceFormat>
-        <inkml:channelProperties>
-          <inkml:channelProperty channel="X" name="resolution" value="1000" units="1/cm"/>
-          <inkml:channelProperty channel="Y" name="resolution" value="1000" units="1/cm"/>
-        </inkml:channelProperties>
-      </inkml:inkSource>
-      <inkml:timestamp xml:id="ts0" timeString="2024-03-06T15:05:59.970"/>
-    </inkml:context>
-    <inkml:brush xml:id="br0">
-      <inkml:brushProperty name="width" value="0.025" units="cm"/>
-      <inkml:brushProperty name="height" value="0.025" units="cm"/>
-      <inkml:brushProperty name="ignorePressure" value="1"/>
-    </inkml:brush>
-  </inkml:definitions>
-  <inkml:trace contextRef="#ctx0" brushRef="#br0">0 1,'18622'0,"-18600"0</inkml:trace>
-</inkml:ink>
-</file>
-
-<file path=word/ink/ink6.xml><?xml version="1.0" encoding="utf-8"?>
-<inkml:ink xmlns:inkml="http://www.w3.org/2003/InkML">
-  <inkml:definitions>
-    <inkml:context xml:id="ctx0">
-      <inkml:inkSource xml:id="inkSrc0">
-        <inkml:traceFormat>
-          <inkml:channel name="X" type="integer" min="-2.14748E9" max="2.14748E9" units="cm"/>
-          <inkml:channel name="Y" type="integer" min="-2.14748E9" max="2.14748E9" units="cm"/>
-          <inkml:channel name="F" type="integer" max="32767" units="dev"/>
-        </inkml:traceFormat>
-        <inkml:channelProperties>
-          <inkml:channelProperty channel="X" name="resolution" value="1000" units="1/cm"/>
-          <inkml:channelProperty channel="Y" name="resolution" value="1000" units="1/cm"/>
-          <inkml:channelProperty channel="F" name="resolution" value="0" units="1/dev"/>
-        </inkml:channelProperties>
-      </inkml:inkSource>
-      <inkml:timestamp xml:id="ts0" timeString="2024-03-06T15:06:25.350"/>
-    </inkml:context>
-    <inkml:brush xml:id="br0">
-      <inkml:brushProperty name="width" value="0.025" units="cm"/>
-      <inkml:brushProperty name="height" value="0.025" units="cm"/>
-    </inkml:brush>
-  </inkml:definitions>
-  <inkml:trace contextRef="#ctx0" brushRef="#br0">0 0 24575,'0'0'-8191</inkml:trace>
-</inkml:ink>
-</file>
-
-<file path=word/ink/ink7.xml><?xml version="1.0" encoding="utf-8"?>
 <inkml:ink xmlns:inkml="http://www.w3.org/2003/InkML">
   <inkml:definitions>
     <inkml:context xml:id="ctx0">

</xml_diff>